<commit_message>
Actualizar docx OE2: corrección indicaciones HNSCC + figuras integradas
- Fix Tabla 4: corrección de indicación HNSCC en 7 fármacos (Lapatinib, Valproic Acid, Gefitinib, Erlotinib, Nimotuzumab, Panitumumab, Dacomitinib) → No; solo Afatinib y Cetuximab mantienen Sí
- Barplot C2: fusión categorías aprobados → "Aprobado" único (Fase IV + aprobado sin fase ChEMBL)
- Red PPI OE2_FigA: sin título/subtítulo, labels más grandes (2.6) sin bold, figura más ancha
- Inserción en docx: FigA (red PPI), FigB (barplot módulos), FigC (distribución clases) en sección OE2
- Actualizar C2 en docx con versión corregida

Co-Authored-By: Claude Sonnet 4.6 <noreply@anthropic.com>
</commit_message>
<xml_diff>
--- a/docs/HNSCC_DrugRepurposing_Figuras.docx
+++ b/docs/HNSCC_DrugRepurposing_Figuras.docx
@@ -9252,6 +9252,52 @@
         <w:t xml:space="preserve">Top 30 candidatos farmacológicos por número de fuentes de respaldo</w:t>
       </w:r>
     </w:p>
+    <w:p>
+      <w:pPr>
+        <w:spacing w:after="80" w:before="200"/>
+        <w:jc w:val="center"/>
+      </w:pPr>
+      <w:r>
+        <w:drawing>
+          <wp:inline distT="0" distB="0" distL="0" distR="0">
+            <wp:extent cx="5486400" cy="4801083"/>
+            <wp:effectExtent t="0" r="0" b="0" l="0"/>
+            <wp:docPr id="8" name="OE2_FigA_ppi_network" descr="OE2_FigA_ppi_network" title="OE2_FigA_ppi_network"/>
+            <wp:cNvGraphicFramePr>
+              <a:graphicFrameLocks xmlns:a="http://schemas.openxmlformats.org/drawingml/2006/main" noChangeAspect="1"/>
+            </wp:cNvGraphicFramePr>
+            <a:graphic xmlns:a="http://schemas.openxmlformats.org/drawingml/2006/main">
+              <a:graphicData uri="http://schemas.openxmlformats.org/drawingml/2006/picture">
+                <pic:pic xmlns:pic="http://schemas.openxmlformats.org/drawingml/2006/picture">
+                  <pic:nvPicPr>
+                    <pic:cNvPr id="0" name="" descr=""/>
+                    <pic:cNvPicPr>
+                      <a:picLocks noChangeAspect="1" noChangeArrowheads="1"/>
+                    </pic:cNvPicPr>
+                  </pic:nvPicPr>
+                  <pic:blipFill>
+                    <a:blip r:embed="rId15" cstate="none"/>
+                    <a:srcRect/>
+                    <a:stretch>
+                      <a:fillRect/>
+                    </a:stretch>
+                  </pic:blipFill>
+                  <pic:spPr bwMode="auto">
+                    <a:xfrm>
+                      <a:off x="0" y="0"/>
+                      <a:ext cx="5486400" cy="4801083"/>
+                    </a:xfrm>
+                    <a:prstGeom prst="rect">
+                      <a:avLst/>
+                    </a:prstGeom>
+                  </pic:spPr>
+                </pic:pic>
+              </a:graphicData>
+            </a:graphic>
+          </wp:inline>
+        </w:drawing>
+      </w:r>
+    </w:p>
     <w:tbl>
       <w:tblPr>
         <w:tblW w:type="dxa" w:w="9966"/>
@@ -9847,7 +9893,7 @@
                 <w:sz w:val="18"/>
                 <w:szCs w:val="18"/>
               </w:rPr>
-              <w:t xml:space="preserve">Sí</w:t>
+              <w:t xml:space="preserve">No</w:t>
             </w:r>
           </w:p>
         </w:tc>
@@ -10059,7 +10105,7 @@
                 <w:sz w:val="18"/>
                 <w:szCs w:val="18"/>
               </w:rPr>
-              <w:t xml:space="preserve">Sí</w:t>
+              <w:t xml:space="preserve">No</w:t>
             </w:r>
           </w:p>
         </w:tc>
@@ -10271,7 +10317,7 @@
                 <w:sz w:val="18"/>
                 <w:szCs w:val="18"/>
               </w:rPr>
-              <w:t xml:space="preserve">Sí</w:t>
+              <w:t xml:space="preserve">No</w:t>
             </w:r>
           </w:p>
         </w:tc>
@@ -13027,7 +13073,7 @@
                 <w:sz w:val="18"/>
                 <w:szCs w:val="18"/>
               </w:rPr>
-              <w:t xml:space="preserve">Sí</w:t>
+              <w:t xml:space="preserve">No</w:t>
             </w:r>
           </w:p>
         </w:tc>
@@ -13239,7 +13285,7 @@
                 <w:sz w:val="18"/>
                 <w:szCs w:val="18"/>
               </w:rPr>
-              <w:t xml:space="preserve">Sí</w:t>
+              <w:t xml:space="preserve">No</w:t>
             </w:r>
           </w:p>
         </w:tc>
@@ -13451,7 +13497,7 @@
                 <w:sz w:val="18"/>
                 <w:szCs w:val="18"/>
               </w:rPr>
-              <w:t xml:space="preserve">Sí</w:t>
+              <w:t xml:space="preserve">No</w:t>
             </w:r>
           </w:p>
         </w:tc>
@@ -13663,7 +13709,7 @@
                 <w:sz w:val="18"/>
                 <w:szCs w:val="18"/>
               </w:rPr>
-              <w:t xml:space="preserve">Sí</w:t>
+              <w:t xml:space="preserve">No</w:t>
             </w:r>
           </w:p>
         </w:tc>
@@ -21130,6 +21176,98 @@
         </w:tc>
       </w:tr>
     </w:tbl>
+    <w:p>
+      <w:pPr>
+        <w:spacing w:after="80" w:before="200"/>
+        <w:jc w:val="center"/>
+      </w:pPr>
+      <w:r>
+        <w:drawing>
+          <wp:inline distT="0" distB="0" distL="0" distR="0">
+            <wp:extent cx="5486400" cy="3658460"/>
+            <wp:effectExtent t="0" r="0" b="0" l="0"/>
+            <wp:docPr id="9" name="OE2_FigB_module_barplot" descr="OE2_FigB_module_barplot" title="OE2_FigB_module_barplot"/>
+            <wp:cNvGraphicFramePr>
+              <a:graphicFrameLocks xmlns:a="http://schemas.openxmlformats.org/drawingml/2006/main" noChangeAspect="1"/>
+            </wp:cNvGraphicFramePr>
+            <a:graphic xmlns:a="http://schemas.openxmlformats.org/drawingml/2006/main">
+              <a:graphicData uri="http://schemas.openxmlformats.org/drawingml/2006/picture">
+                <pic:pic xmlns:pic="http://schemas.openxmlformats.org/drawingml/2006/picture">
+                  <pic:nvPicPr>
+                    <pic:cNvPr id="0" name="" descr=""/>
+                    <pic:cNvPicPr>
+                      <a:picLocks noChangeAspect="1" noChangeArrowheads="1"/>
+                    </pic:cNvPicPr>
+                  </pic:nvPicPr>
+                  <pic:blipFill>
+                    <a:blip r:embed="rId16" cstate="none"/>
+                    <a:srcRect/>
+                    <a:stretch>
+                      <a:fillRect/>
+                    </a:stretch>
+                  </pic:blipFill>
+                  <pic:spPr bwMode="auto">
+                    <a:xfrm>
+                      <a:off x="0" y="0"/>
+                      <a:ext cx="5486400" cy="3658460"/>
+                    </a:xfrm>
+                    <a:prstGeom prst="rect">
+                      <a:avLst/>
+                    </a:prstGeom>
+                  </pic:spPr>
+                </pic:pic>
+              </a:graphicData>
+            </a:graphic>
+          </wp:inline>
+        </w:drawing>
+      </w:r>
+    </w:p>
+    <w:p>
+      <w:pPr>
+        <w:spacing w:after="80" w:before="200"/>
+        <w:jc w:val="center"/>
+      </w:pPr>
+      <w:r>
+        <w:drawing>
+          <wp:inline distT="0" distB="0" distL="0" distR="0">
+            <wp:extent cx="5486400" cy="3963117"/>
+            <wp:effectExtent t="0" r="0" b="0" l="0"/>
+            <wp:docPr id="10" name="OE2_FigC_class_distribution" descr="OE2_FigC_class_distribution" title="OE2_FigC_class_distribution"/>
+            <wp:cNvGraphicFramePr>
+              <a:graphicFrameLocks xmlns:a="http://schemas.openxmlformats.org/drawingml/2006/main" noChangeAspect="1"/>
+            </wp:cNvGraphicFramePr>
+            <a:graphic xmlns:a="http://schemas.openxmlformats.org/drawingml/2006/main">
+              <a:graphicData uri="http://schemas.openxmlformats.org/drawingml/2006/picture">
+                <pic:pic xmlns:pic="http://schemas.openxmlformats.org/drawingml/2006/picture">
+                  <pic:nvPicPr>
+                    <pic:cNvPr id="0" name="" descr=""/>
+                    <pic:cNvPicPr>
+                      <a:picLocks noChangeAspect="1" noChangeArrowheads="1"/>
+                    </pic:cNvPicPr>
+                  </pic:nvPicPr>
+                  <pic:blipFill>
+                    <a:blip r:embed="rId17" cstate="none"/>
+                    <a:srcRect/>
+                    <a:stretch>
+                      <a:fillRect/>
+                    </a:stretch>
+                  </pic:blipFill>
+                  <pic:spPr bwMode="auto">
+                    <a:xfrm>
+                      <a:off x="0" y="0"/>
+                      <a:ext cx="5486400" cy="3963117"/>
+                    </a:xfrm>
+                    <a:prstGeom prst="rect">
+                      <a:avLst/>
+                    </a:prstGeom>
+                  </pic:spPr>
+                </pic:pic>
+              </a:graphicData>
+            </a:graphic>
+          </wp:inline>
+        </w:drawing>
+      </w:r>
+    </w:p>
     <w:p>
       <w:pPr>
         <w:spacing w:after="80" w:before="60"/>

</xml_diff>

<commit_message>
pre-cleanup snapshot: estado completo antes de reducir al reporte revisado
</commit_message>
<xml_diff>
--- a/docs/HNSCC_DrugRepurposing_Figuras.docx
+++ b/docs/HNSCC_DrugRepurposing_Figuras.docx
@@ -1,6 +1,6 @@
 
 <file path=word/document.xml><?xml version="1.0" encoding="utf-8"?>
-<w:document xmlns:wpc="http://schemas.microsoft.com/office/word/2010/wordprocessingCanvas" xmlns:mc="http://schemas.openxmlformats.org/markup-compatibility/2006" xmlns:o="urn:schemas-microsoft-com:office:office" xmlns:r="http://schemas.openxmlformats.org/officeDocument/2006/relationships" xmlns:m="http://schemas.openxmlformats.org/officeDocument/2006/math" xmlns:v="urn:schemas-microsoft-com:vml" xmlns:wp14="http://schemas.microsoft.com/office/word/2010/wordprocessingDrawing" xmlns:wp="http://schemas.openxmlformats.org/drawingml/2006/wordprocessingDrawing" xmlns:w10="urn:schemas-microsoft-com:office:word" xmlns:w="http://schemas.openxmlformats.org/wordprocessingml/2006/main" xmlns:w14="http://schemas.microsoft.com/office/word/2010/wordml" xmlns:w15="http://schemas.microsoft.com/office/word/2012/wordml" xmlns:wpg="http://schemas.microsoft.com/office/word/2010/wordprocessingGroup" xmlns:wpi="http://schemas.microsoft.com/office/word/2010/wordprocessingInk" xmlns:wne="http://schemas.microsoft.com/office/word/2006/wordml" xmlns:wps="http://schemas.microsoft.com/office/word/2010/wordprocessingShape" xmlns:cx="http://schemas.microsoft.com/office/drawing/2014/chartex" xmlns:cx1="http://schemas.microsoft.com/office/drawing/2015/9/8/chartex" xmlns:cx2="http://schemas.microsoft.com/office/drawing/2015/10/21/chartex" xmlns:cx3="http://schemas.microsoft.com/office/drawing/2016/5/9/chartex" xmlns:cx4="http://schemas.microsoft.com/office/drawing/2016/5/10/chartex" xmlns:cx5="http://schemas.microsoft.com/office/drawing/2016/5/11/chartex" xmlns:cx6="http://schemas.microsoft.com/office/drawing/2016/5/12/chartex" xmlns:cx7="http://schemas.microsoft.com/office/drawing/2016/5/13/chartex" xmlns:cx8="http://schemas.microsoft.com/office/drawing/2016/5/14/chartex" xmlns:aink="http://schemas.microsoft.com/office/drawing/2016/ink" xmlns:am3d="http://schemas.microsoft.com/office/drawing/2017/model3d" xmlns:w16cex="http://schemas.microsoft.com/office/word/2018/wordml/cex" xmlns:w16cid="http://schemas.microsoft.com/office/word/2016/wordml/cid" xmlns:w16="http://schemas.microsoft.com/office/word/2018/wordml" xmlns:w16sdtdh="http://schemas.microsoft.com/office/word/2020/wordml/sdtdatahash" xmlns:w16se="http://schemas.microsoft.com/office/word/2015/wordml/symex" mc:Ignorable="w14 w15 wp14">
+<w:document xmlns:a="http://schemas.openxmlformats.org/drawingml/2006/main" xmlns:mc="http://schemas.openxmlformats.org/markup-compatibility/2006" xmlns:pic="http://schemas.openxmlformats.org/drawingml/2006/picture" xmlns:r="http://schemas.openxmlformats.org/officeDocument/2006/relationships" xmlns:w="http://schemas.openxmlformats.org/wordprocessingml/2006/main" xmlns:wp="http://schemas.openxmlformats.org/drawingml/2006/wordprocessingDrawing" mc:Ignorable="w14 w15 wp14">
   <w:body>
     <w:p>
       <w:pPr>
@@ -48,17 +48,11 @@
     </w:p>
     <w:p>
       <w:pPr>
-        <w:pBdr>
-          <w:bottom w:val="single" w:color="B0C8E0" w:sz="6" w:space="3"/>
-        </w:pBdr>
         <w:spacing w:after="0" w:before="160"/>
       </w:pPr>
     </w:p>
     <w:p>
       <w:pPr>
-        <w:pBdr>
-          <w:bottom w:val="single" w:color="2E75B6" w:sz="10" w:space="4"/>
-        </w:pBdr>
         <w:spacing w:after="100" w:before="280"/>
       </w:pPr>
       <w:r>
@@ -75,9 +69,6 @@
     </w:p>
     <w:p>
       <w:pPr>
-        <w:pBdr>
-          <w:left w:val="single" w:color="2E75B6" w:sz="12" w:space="6"/>
-        </w:pBdr>
         <w:spacing w:after="160" w:before="60"/>
         <w:ind w:left="360"/>
       </w:pPr>
@@ -95,17 +86,11 @@
     </w:p>
     <w:p>
       <w:pPr>
-        <w:pBdr>
-          <w:bottom w:val="single" w:color="B0C8E0" w:sz="6" w:space="3"/>
-        </w:pBdr>
         <w:spacing w:after="0" w:before="160"/>
       </w:pPr>
     </w:p>
     <w:p>
       <w:pPr>
-        <w:pBdr>
-          <w:bottom w:val="single" w:color="2E75B6" w:sz="10" w:space="4"/>
-        </w:pBdr>
         <w:spacing w:after="100" w:before="280"/>
       </w:pPr>
       <w:r>
@@ -146,11 +131,11 @@
             <wp:effectExtent t="0" r="0" b="0" l="0"/>
             <wp:docPr id="1" name="Sec0_FigB_volcano.png" descr="Sec0_FigB_volcano.png" title="Sec0_FigB_volcano.png"/>
             <wp:cNvGraphicFramePr>
-              <a:graphicFrameLocks xmlns:a="http://schemas.openxmlformats.org/drawingml/2006/main" noChangeAspect="1"/>
+              <a:graphicFrameLocks noChangeAspect="1"/>
             </wp:cNvGraphicFramePr>
-            <a:graphic xmlns:a="http://schemas.openxmlformats.org/drawingml/2006/main">
+            <a:graphic>
               <a:graphicData uri="http://schemas.openxmlformats.org/drawingml/2006/picture">
-                <pic:pic xmlns:pic="http://schemas.openxmlformats.org/drawingml/2006/picture">
+                <pic:pic>
                   <pic:nvPicPr>
                     <pic:cNvPr id="0" name="" descr=""/>
                     <pic:cNvPicPr>
@@ -220,11 +205,11 @@
             <wp:effectExtent t="0" r="0" b="0" l="0"/>
             <wp:docPr id="1" name="Sec0_FigC_heatmap_topDE.png" descr="Sec0_FigC_heatmap_topDE.png" title="Sec0_FigC_heatmap_topDE.png"/>
             <wp:cNvGraphicFramePr>
-              <a:graphicFrameLocks xmlns:a="http://schemas.openxmlformats.org/drawingml/2006/main" noChangeAspect="1"/>
+              <a:graphicFrameLocks noChangeAspect="1"/>
             </wp:cNvGraphicFramePr>
-            <a:graphic xmlns:a="http://schemas.openxmlformats.org/drawingml/2006/main">
+            <a:graphic>
               <a:graphicData uri="http://schemas.openxmlformats.org/drawingml/2006/picture">
-                <pic:pic xmlns:pic="http://schemas.openxmlformats.org/drawingml/2006/picture">
+                <pic:pic>
                   <pic:nvPicPr>
                     <pic:cNvPr id="0" name="" descr=""/>
                     <pic:cNvPicPr>
@@ -7549,9 +7534,6 @@
     </w:p>
     <w:p>
       <w:pPr>
-        <w:pBdr>
-          <w:bottom w:val="single" w:color="2E75B6" w:sz="10" w:space="4"/>
-        </w:pBdr>
         <w:spacing w:after="100" w:before="280"/>
       </w:pPr>
       <w:r>
@@ -7568,9 +7550,6 @@
     </w:p>
     <w:p>
       <w:pPr>
-        <w:pBdr>
-          <w:left w:val="single" w:color="2E75B6" w:sz="12" w:space="6"/>
-        </w:pBdr>
         <w:spacing w:after="160" w:before="60"/>
         <w:ind w:left="360"/>
       </w:pPr>
@@ -7598,11 +7577,11 @@
             <wp:effectExtent t="0" r="0" b="0" l="0"/>
             <wp:docPr id="1" name="OE1_FigA_drug_sources_bar.png" descr="OE1_FigA_drug_sources_bar.png" title="OE1_FigA_drug_sources_bar.png"/>
             <wp:cNvGraphicFramePr>
-              <a:graphicFrameLocks xmlns:a="http://schemas.openxmlformats.org/drawingml/2006/main" noChangeAspect="1"/>
+              <a:graphicFrameLocks noChangeAspect="1"/>
             </wp:cNvGraphicFramePr>
-            <a:graphic xmlns:a="http://schemas.openxmlformats.org/drawingml/2006/main">
+            <a:graphic>
               <a:graphicData uri="http://schemas.openxmlformats.org/drawingml/2006/picture">
-                <pic:pic xmlns:pic="http://schemas.openxmlformats.org/drawingml/2006/picture">
+                <pic:pic>
                   <pic:nvPicPr>
                     <pic:cNvPr id="0" name="" descr=""/>
                     <pic:cNvPicPr>
@@ -7672,11 +7651,11 @@
             <wp:effectExtent t="0" r="0" b="0" l="0"/>
             <wp:docPr id="1" name="OE1_FigB_drug_phase_dist.png" descr="OE1_FigB_drug_phase_dist.png" title="OE1_FigB_drug_phase_dist.png"/>
             <wp:cNvGraphicFramePr>
-              <a:graphicFrameLocks xmlns:a="http://schemas.openxmlformats.org/drawingml/2006/main" noChangeAspect="1"/>
+              <a:graphicFrameLocks noChangeAspect="1"/>
             </wp:cNvGraphicFramePr>
-            <a:graphic xmlns:a="http://schemas.openxmlformats.org/drawingml/2006/main">
+            <a:graphic>
               <a:graphicData uri="http://schemas.openxmlformats.org/drawingml/2006/picture">
-                <pic:pic xmlns:pic="http://schemas.openxmlformats.org/drawingml/2006/picture">
+                <pic:pic>
                   <pic:nvPicPr>
                     <pic:cNvPr id="0" name="" descr=""/>
                     <pic:cNvPicPr>
@@ -9042,11 +9021,11 @@
             <wp:effectExtent t="0" r="0" b="0" l="0"/>
             <wp:docPr id="8" name="OE2_FigA_ppi_network" descr="OE2_FigA_ppi_network" title="OE2_FigA_ppi_network"/>
             <wp:cNvGraphicFramePr>
-              <a:graphicFrameLocks xmlns:a="http://schemas.openxmlformats.org/drawingml/2006/main" noChangeAspect="1"/>
+              <a:graphicFrameLocks noChangeAspect="1"/>
             </wp:cNvGraphicFramePr>
-            <a:graphic xmlns:a="http://schemas.openxmlformats.org/drawingml/2006/main">
+            <a:graphic>
               <a:graphicData uri="http://schemas.openxmlformats.org/drawingml/2006/picture">
-                <pic:pic xmlns:pic="http://schemas.openxmlformats.org/drawingml/2006/picture">
+                <pic:pic>
                   <pic:nvPicPr>
                     <pic:cNvPr id="0" name="" descr=""/>
                     <pic:cNvPicPr>
@@ -15680,9 +15659,6 @@
     </w:p>
     <w:p>
       <w:pPr>
-        <w:pBdr>
-          <w:bottom w:val="single" w:color="B0C8E0" w:sz="6" w:space="3"/>
-        </w:pBdr>
         <w:spacing w:after="0" w:before="240"/>
       </w:pPr>
       <w:r>
@@ -20966,11 +20942,11 @@
             <wp:effectExtent t="0" r="0" b="0" l="0"/>
             <wp:docPr id="9" name="OE2_FigB_module_barplot" descr="OE2_FigB_module_barplot" title="OE2_FigB_module_barplot"/>
             <wp:cNvGraphicFramePr>
-              <a:graphicFrameLocks xmlns:a="http://schemas.openxmlformats.org/drawingml/2006/main" noChangeAspect="1"/>
+              <a:graphicFrameLocks noChangeAspect="1"/>
             </wp:cNvGraphicFramePr>
-            <a:graphic xmlns:a="http://schemas.openxmlformats.org/drawingml/2006/main">
+            <a:graphic>
               <a:graphicData uri="http://schemas.openxmlformats.org/drawingml/2006/picture">
-                <pic:pic xmlns:pic="http://schemas.openxmlformats.org/drawingml/2006/picture">
+                <pic:pic>
                   <pic:nvPicPr>
                     <pic:cNvPr id="0" name="" descr=""/>
                     <pic:cNvPicPr>
@@ -21012,11 +20988,11 @@
             <wp:effectExtent t="0" r="0" b="0" l="0"/>
             <wp:docPr id="10" name="OE2_FigC_class_distribution" descr="OE2_FigC_class_distribution" title="OE2_FigC_class_distribution"/>
             <wp:cNvGraphicFramePr>
-              <a:graphicFrameLocks xmlns:a="http://schemas.openxmlformats.org/drawingml/2006/main" noChangeAspect="1"/>
+              <a:graphicFrameLocks noChangeAspect="1"/>
             </wp:cNvGraphicFramePr>
-            <a:graphic xmlns:a="http://schemas.openxmlformats.org/drawingml/2006/main">
+            <a:graphic>
               <a:graphicData uri="http://schemas.openxmlformats.org/drawingml/2006/picture">
-                <pic:pic xmlns:pic="http://schemas.openxmlformats.org/drawingml/2006/picture">
+                <pic:pic>
                   <pic:nvPicPr>
                     <pic:cNvPr id="0" name="" descr=""/>
                     <pic:cNvPicPr>

</xml_diff>